<commit_message>
Add Prolific setup guide (primary route per Dr. Rey) + update Sarmed tracker to prioritize Prolific
Co-Authored-By: Claude Opus 4.8 (1M context) <noreply@anthropic.com>
Claude-Session: https://claude.ai/code/session_019uQWfMoV11me5yJ6LYRtPv
</commit_message>
<xml_diff>
--- a/dba/Sarmed_Handoff_and_Tracker.docx
+++ b/dba/Sarmed_Handoff_and_Tracker.docx
@@ -101,16 +101,16 @@
         <w:t>Context:</w:t>
       </w:r>
       <w:r>
-        <w:t xml:space="preserve"> CloudResearch's self-service panel can't reach auditors (niche professional audience), so we need a paid </w:t>
+        <w:t xml:space="preserve"> CloudResearch's self-service panel can't reach auditors. </w:t>
       </w:r>
       <w:r>
         <w:rPr>
           <w:b/>
         </w:rPr>
-        <w:t>managed panel</w:t>
+        <w:t>Dr. Rey recommended Prolific — that is now our PRIMARY route</w:t>
       </w:r>
       <w:r>
-        <w:t xml:space="preserve"> and/or free professional outreach. The survey is LIVE and works via the direct link right now.</w:t>
+        <w:t xml:space="preserve"> (prescreens by occupation/industry, fast, cheaper than managed research). CloudResearch Managed Research is the backup. The survey is LIVE via the direct link now.</w:t>
       </w:r>
     </w:p>
     <w:p>
@@ -138,7 +138,34 @@
     </w:p>
     <w:p>
       <w:r>
-        <w:t xml:space="preserve">| 1 | Reply to CloudResearch Managed Research (JB) with study spec → get quote | Sarmed | </w:t>
+        <w:t xml:space="preserve">| </w:t>
+      </w:r>
+      <w:r>
+        <w:rPr>
+          <w:b/>
+        </w:rPr>
+        <w:t>1</w:t>
+      </w:r>
+      <w:r>
+        <w:t xml:space="preserve"> | </w:t>
+      </w:r>
+      <w:r>
+        <w:rPr>
+          <w:b/>
+        </w:rPr>
+        <w:t>Set up Prolific study</w:t>
+      </w:r>
+      <w:r>
+        <w:t xml:space="preserve"> (account → build → prescreen US audit/finance → check eligible count → soft-launch 15) — see </w:t>
+      </w:r>
+      <w:r>
+        <w:rPr>
+          <w:rFonts w:ascii="Courier New" w:hAnsi="Courier New"/>
+        </w:rPr>
+        <w:t>Prolific_Setup_Guide.md</w:t>
+      </w:r>
+      <w:r>
+        <w:t xml:space="preserve"> | Sarmed + Yasir | </w:t>
       </w:r>
       <w:r>
         <w:rPr>
@@ -152,7 +179,44 @@
     </w:p>
     <w:p>
       <w:r>
-        <w:t xml:space="preserve">| 2 | Get 2–3 competing panel quotes (Prolific, Prime Panels, Centiment, Qualtrics) | Sarmed | </w:t>
+        <w:t xml:space="preserve">| 2 | Report Prolific </w:t>
+      </w:r>
+      <w:r>
+        <w:rPr>
+          <w:b/>
+        </w:rPr>
+        <w:t>eligible-participant count</w:t>
+      </w:r>
+      <w:r>
+        <w:t xml:space="preserve"> (tells us if supply is there) | Sarmed | </w:t>
+      </w:r>
+      <w:r>
+        <w:rPr>
+          <w:b/>
+        </w:rPr>
+        <w:t>Jul 2</w:t>
+      </w:r>
+      <w:r>
+        <w:t xml:space="preserve"> | ☐ |</w:t>
+      </w:r>
+    </w:p>
+    <w:p>
+      <w:r>
+        <w:t xml:space="preserve">| 3 | Finalize Qualtrics for launch (consent letter, Prolific completion redirect + PROLIFIC_PID, force-response) | Sarmed + Yasir | </w:t>
+      </w:r>
+      <w:r>
+        <w:rPr>
+          <w:b/>
+        </w:rPr>
+        <w:t>Jul 2</w:t>
+      </w:r>
+      <w:r>
+        <w:t xml:space="preserve"> | ☐ |</w:t>
+      </w:r>
+    </w:p>
+    <w:p>
+      <w:r>
+        <w:t xml:space="preserve">| 4 | BACKUP: get CloudResearch Managed Research quote (only if Prolific supply thin) | Sarmed | </w:t>
       </w:r>
       <w:r>
         <w:rPr>
@@ -166,35 +230,7 @@
     </w:p>
     <w:p>
       <w:r>
-        <w:t xml:space="preserve">| 3 | Build the quote-comparison (cost / speed / auditor verification) | Sarmed | </w:t>
-      </w:r>
-      <w:r>
-        <w:rPr>
-          <w:b/>
-        </w:rPr>
-        <w:t>Jul 3</w:t>
-      </w:r>
-      <w:r>
-        <w:t xml:space="preserve"> | ☐ |</w:t>
-      </w:r>
-    </w:p>
-    <w:p>
-      <w:r>
-        <w:t xml:space="preserve">| 4 | Finalize Qualtrics for launch (screen-outs, consent letter, force-response, redirect) | Sarmed + Yasir | </w:t>
-      </w:r>
-      <w:r>
-        <w:rPr>
-          <w:b/>
-        </w:rPr>
-        <w:t>Jul 3</w:t>
-      </w:r>
-      <w:r>
-        <w:t xml:space="preserve"> | ☐ |</w:t>
-      </w:r>
-    </w:p>
-    <w:p>
-      <w:r>
-        <w:t xml:space="preserve">| 5 | Launch free outreach — LinkedIn + IIA/AICPA chapters + FIU alumni | Sarmed | </w:t>
+        <w:t xml:space="preserve">| 5 | Free outreach — LinkedIn + IIA/AICPA chapters + FIU alumni | Sarmed | </w:t>
       </w:r>
       <w:r>
         <w:rPr>
@@ -208,7 +244,7 @@
     </w:p>
     <w:p>
       <w:r>
-        <w:t xml:space="preserve">| 6 | Provide IRB consent letter + approve panel spend | </w:t>
+        <w:t xml:space="preserve">| 6 | Provide IRB consent letter + approve spend | </w:t>
       </w:r>
       <w:r>
         <w:rPr>
@@ -231,7 +267,7 @@
     </w:p>
     <w:p>
       <w:r>
-        <w:t xml:space="preserve">| 7 | Pick panel + fund + launch | </w:t>
+        <w:t xml:space="preserve">| 7 | Fund Prolific + scale to 100 | </w:t>
       </w:r>
       <w:r>
         <w:rPr>
@@ -246,7 +282,7 @@
         <w:rPr>
           <w:b/>
         </w:rPr>
-        <w:t>Jul 4</w:t>
+        <w:t>Jul 3</w:t>
       </w:r>
       <w:r>
         <w:t xml:space="preserve"> | ☐ |</w:t>
@@ -274,7 +310,7 @@
         <w:rPr>
           <w:b/>
         </w:rPr>
-        <w:t>Jul 11</w:t>
+        <w:t>Jul 9–10</w:t>
       </w:r>
       <w:r>
         <w:t xml:space="preserve"> | ☐ |</w:t>

</xml_diff>